<commit_message>
ways-in paper: 'practice' spelling throughout (site wording rule)
Co-Authored-By: Claude Sonnet 5.5 <noreply@anthropic.com>
</commit_message>
<xml_diff>
--- a/docs/founder/ways-into-the-platform.docx
+++ b/docs/founder/ways-into-the-platform.docx
@@ -1143,7 +1143,7 @@
         <w:rPr>
           <w:b w:val="0"/>
         </w:rPr>
-        <w:t xml:space="preserve"> A recruiter's income depends on one moment: the candidate performing well at the interview. Everything before it, the sourcing, the screening, the submission, is wasted if the candidate fumbles. Yet the support at that moment is usually "good luck on Thursday". Recruiters will see at once that it is best for them and for the candidate if the candidate goes in better prepared, having practised for the exact role, based on the CV the client has already seen and thinks fits the job.</w:t>
+        <w:t xml:space="preserve"> A recruiter's income depends on one moment: the candidate performing well at the interview. Everything before it, the sourcing, the screening, the submission, is wasted if the candidate fumbles. Yet the support at that moment is usually "good luck on Thursday". Recruiters will see at once that it is best for them and for the candidate if the candidate goes in better prepared, having practiced for the exact role, based on the CV the client has already seen and thinks fits the job.</w:t>
       </w:r>
     </w:p>
     <w:p>
@@ -1154,7 +1154,7 @@
         <w:rPr>
           <w:b w:val="0"/>
         </w:rPr>
-        <w:t>Our interviews are built from the job spec and the candidate's CV together, so the questions go straight to the gaps between what the candidate says on their CV and what the client wants. That gives the candidate the chance to close those gaps and practise thoroughly before the real interview, not during it.</w:t>
+        <w:t>Our interviews are built from the job spec and the candidate's CV together, so the questions go straight to the gaps between what the candidate says on their CV and what the client wants. That gives the candidate the chance to close those gaps and practice thoroughly before the real interview, not during it.</w:t>
       </w:r>
     </w:p>
     <w:p>
@@ -1470,7 +1470,7 @@
         <w:rPr>
           <w:b w:val="0"/>
         </w:rPr>
-        <w:t>A "Practise for this job" button on a job advert (section 4).</w:t>
+        <w:t>A "Practice for this job" button on a job advert (section 4).</w:t>
       </w:r>
     </w:p>
     <w:p>
@@ -1531,7 +1531,7 @@
         <w:rPr>
           <w:b w:val="0"/>
         </w:rPr>
-        <w:t xml:space="preserve"> A monthly subscription, and the most important thing for the platform: a growing pool of practised, scored candidates that employers and recruiters want to find.</w:t>
+        <w:t xml:space="preserve"> A monthly subscription, and the most important thing for the platform: a growing pool of practiced, scored candidates that employers and recruiters want to find.</w:t>
       </w:r>
     </w:p>
     <w:p>
@@ -1578,7 +1578,7 @@
         <w:rPr>
           <w:b w:val="0"/>
         </w:rPr>
-        <w:t xml:space="preserve"> The most natural moment to practise is the moment you decide to apply. One click from the advert puts the applicant into a practice interview for that exact job, with the job spec already loaded.</w:t>
+        <w:t xml:space="preserve"> The most natural moment to practice is the moment you decide to apply. One click from the advert puts the applicant into a practice interview for that exact job, with the job spec already loaded.</w:t>
       </w:r>
     </w:p>
     <w:p>
@@ -1595,7 +1595,7 @@
         <w:rPr>
           <w:b w:val="0"/>
         </w:rPr>
-        <w:t xml:space="preserve"> A "Practise for this job" button, or a simple per-job practice link a recruiter pastes into any advert. Recruiters can add it to every job they post. Job boards and employer careers pages can add it as a feature for their applicants.</w:t>
+        <w:t xml:space="preserve"> A "Practice for this job" button, or a simple per-job practice link a recruiter pastes into any advert. Recruiters can add it to every job they post. Job boards and employer careers pages can add it as a feature for their applicants.</w:t>
       </w:r>
     </w:p>
     <w:p>

</xml_diff>